<commit_message>
Sync handoff doc (md + docx) with cleaned page copy; remove em dashes
Co-Authored-By: Claude Opus 4.8 <noreply@anthropic.com>
Claude-Session: https://claude.ai/code/session_01H6WcoaHy6tVMZo8VH9bRbB
</commit_message>
<xml_diff>
--- a/about-trillet-handoff.docx
+++ b/about-trillet-handoff.docx
@@ -34,7 +34,7 @@
         <w:rPr>
           <w:color w:val="0E1B22"/>
         </w:rPr>
-        <w:t xml:space="preserve">About Page — Publish-Ready Build &amp; Developer Handoff</w:t>
+        <w:t xml:space="preserve">About Page, Publish-Ready Build &amp; Developer Handoff</w:t>
       </w:r>
     </w:p>
     <w:p>
@@ -252,22 +252,22 @@
           <w:sz w:val="16"/>
           <w:szCs w:val="16"/>
         </w:rPr>
-        <w:t xml:space="preserve">  high-stakes, regulated conversations end-to-end — authenticating identity, acting in</w:t>
-      </w:r>
-    </w:p>
-    <w:p>
-      <w:pPr>
-        <w:shd w:fill="F2F5F5" w:color="auto" w:val="clear"/>
-        <w:spacing w:after="0" w:line="240"/>
-      </w:pPr>
-      <w:r>
-        <w:rPr>
-          <w:rFonts w:ascii="Consolas" w:cs="Consolas" w:eastAsia="Consolas" w:hAnsi="Consolas"/>
-          <w:color w:val="0E1B22"/>
-          <w:sz w:val="16"/>
-          <w:szCs w:val="16"/>
-        </w:rPr>
-        <w:t xml:space="preserve">  your systems of record, and closing the loop with a full audit trail."&gt;</w:t>
+        <w:t xml:space="preserve">  high-stakes, regulated conversations from start to finish. It verifies identity,</w:t>
+      </w:r>
+    </w:p>
+    <w:p>
+      <w:pPr>
+        <w:shd w:fill="F2F5F5" w:color="auto" w:val="clear"/>
+        <w:spacing w:after="0" w:line="240"/>
+      </w:pPr>
+      <w:r>
+        <w:rPr>
+          <w:rFonts w:ascii="Consolas" w:cs="Consolas" w:eastAsia="Consolas" w:hAnsi="Consolas"/>
+          <w:color w:val="0E1B22"/>
+          <w:sz w:val="16"/>
+          <w:szCs w:val="16"/>
+        </w:rPr>
+        <w:t xml:space="preserve">  acts in your systems of record, and closes the loop with a full audit trail."&gt;</w:t>
       </w:r>
     </w:p>
     <w:p>
@@ -342,7 +342,7 @@
           <w:sz w:val="16"/>
           <w:szCs w:val="16"/>
         </w:rPr>
-        <w:t xml:space="preserve">&lt;meta property="og:title" content="About Trillet — Enterprise Voice AI"&gt;</w:t>
+        <w:t xml:space="preserve">&lt;meta property="og:title" content="About Trillet"&gt;</w:t>
       </w:r>
     </w:p>
     <w:p>
@@ -372,7 +372,7 @@
           <w:sz w:val="16"/>
           <w:szCs w:val="16"/>
         </w:rPr>
-        <w:t xml:space="preserve">  regulated conversations end-to-end. Founded in Melbourne, globally operated."&gt;</w:t>
+        <w:t xml:space="preserve">  regulated conversations from start to finish. Founded in Melbourne, globally operated."&gt;</w:t>
       </w:r>
     </w:p>
     <w:p>
@@ -547,7 +547,7 @@
         <w:spacing w:after="120" w:line="276"/>
       </w:pPr>
       <w:r>
-        <w:t xml:space="preserve">Preserve these tokens; defined once in :root and re-declared for dark mode. The palette is a deliberate jade-teal on a cool neutral — keep the accent as the single bold colour; everything else stays quiet.</w:t>
+        <w:t xml:space="preserve">Preserve these tokens; defined once in :root and re-declared for dark mode. The palette is a deliberate jade-teal on a cool neutral, keep the accent as the single bold colour; everything else stays quiet.</w:t>
       </w:r>
     </w:p>
     <w:p>
@@ -1636,7 +1636,7 @@
         <w:t xml:space="preserve">Display: </w:t>
       </w:r>
       <w:r>
-        <w:t xml:space="preserve">Bricolage Grotesque (600/500) — headings, figures, pull-quotes.</w:t>
+        <w:t xml:space="preserve">Bricolage Grotesque (600/500), headings, figures, pull-quotes.</w:t>
       </w:r>
     </w:p>
     <w:p>
@@ -1656,7 +1656,7 @@
         <w:t xml:space="preserve">Body: </w:t>
       </w:r>
       <w:r>
-        <w:t xml:space="preserve">IBM Plex Sans (400/500/600) — running text.</w:t>
+        <w:t xml:space="preserve">IBM Plex Sans (400/500/600), running text.</w:t>
       </w:r>
     </w:p>
     <w:p>
@@ -1676,7 +1676,7 @@
         <w:t xml:space="preserve">Utility / mono: </w:t>
       </w:r>
       <w:r>
-        <w:t xml:space="preserve">IBM Plex Mono (400/500) — eyebrows, labels, stat keys, data.</w:t>
+        <w:t xml:space="preserve">IBM Plex Mono (400/500), eyebrows, labels, stat keys, data.</w:t>
       </w:r>
     </w:p>
     <w:p>
@@ -1845,7 +1845,7 @@
         <w:rPr>
           <w:color w:val="0E1B22"/>
         </w:rPr>
-        <w:t xml:space="preserve">4.2 Hero — the only &lt;h1&gt;</w:t>
+        <w:t xml:space="preserve">4.2 Hero, the only &lt;h1&gt;</w:t>
       </w:r>
     </w:p>
     <w:p>
@@ -1870,7 +1870,7 @@
         <w:t xml:space="preserve">resolves</w:t>
       </w:r>
       <w:r>
-        <w:t xml:space="preserve"> your highest-stakes conversations.</w:t>
+        <w:t xml:space="preserve"> your high-stakes conversations.</w:t>
       </w:r>
     </w:p>
     <w:p>
@@ -1885,7 +1885,7 @@
         <w:t xml:space="preserve">Sub: </w:t>
       </w:r>
       <w:r>
-        <w:t xml:space="preserve">Trillet handles complex, regulated interactions end-to-end — authenticating the caller, acting inside your systems of record, and closing the loop with a full audit trail. Built for organisations that measure every conversation in risk, compliance, and cost-to-serve.</w:t>
+        <w:t xml:space="preserve">Trillet handles complex, regulated interactions from start to finish. It authenticates the caller, acts inside your systems of record, and closes the loop with a full audit trail. It is built for organisations that measure every conversation in risk, compliance, and cost to serve.</w:t>
       </w:r>
     </w:p>
     <w:p>
@@ -1955,7 +1955,7 @@
         <w:t xml:space="preserve">DESIGN  </w:t>
       </w:r>
       <w:r>
-        <w:t xml:space="preserve">The right-hand “resolution card” (Identity authenticated → Record retrieved → Payment processed → Confirmation + audit log) carries the caption “Illustrative — not a customer record.” Keep that caption so it is never mistaken for real data.</w:t>
+        <w:t xml:space="preserve">The right-hand “resolution card” (Identity authenticated → Record retrieved → Payment processed → Confirmation + audit log) carries the caption “Illustrative, not a customer record.” Keep that caption so it is never mistaken for real data.</w:t>
       </w:r>
     </w:p>
     <w:p>
@@ -2064,7 +2064,7 @@
         <w:t xml:space="preserve">H2: </w:t>
       </w:r>
       <w:r>
-        <w:t xml:space="preserve">Your highest-value conversations are your highest points of exposure.</w:t>
+        <w:t xml:space="preserve">Your most valuable conversations carry the most risk.</w:t>
       </w:r>
     </w:p>
     <w:p>
@@ -2088,7 +2088,7 @@
         <w:t xml:space="preserve">Thesis: </w:t>
       </w:r>
       <w:r>
-        <w:t xml:space="preserve">A voice agent earns its place only when it can do what your best specialist does: authenticate the caller, take authorised action in live systems, and leave a defensible record. Anything short of that is deflection, not resolution.</w:t>
+        <w:t xml:space="preserve">A voice agent earns its place when it can do what your best specialist does: authenticate the caller, take authorised action in live systems, and leave a record you can stand behind. Until it can, it is deflecting the call rather than resolving it.</w:t>
       </w:r>
     </w:p>
     <w:p>
@@ -2100,7 +2100,7 @@
         <w:rPr>
           <w:color w:val="0E1B22"/>
         </w:rPr>
-        <w:t xml:space="preserve">4.5 The platform — how it works</w:t>
+        <w:t xml:space="preserve">4.5 The platform, how it works</w:t>
       </w:r>
     </w:p>
     <w:p>
@@ -2177,7 +2177,7 @@
         <w:t xml:space="preserve">H2: </w:t>
       </w:r>
       <w:r>
-        <w:t xml:space="preserve">Results the business can put a number on.</w:t>
+        <w:t xml:space="preserve">Results you can measure.</w:t>
       </w:r>
     </w:p>
     <w:p>
@@ -2227,7 +2227,7 @@
         <w:t xml:space="preserve">CONFIRM  </w:t>
       </w:r>
       <w:r>
-        <w:t xml:space="preserve">All four stats. Testimonial wording is lightly tightened from public Trustpilot reviews — confirm reviewers are comfortable being quoted, or link each quote to its Trustpilot source.</w:t>
+        <w:t xml:space="preserve">All four stats. Testimonial wording is lightly tightened from public Trustpilot reviews, confirm reviewers are comfortable being quoted, or link each quote to its Trustpilot source.</w:t>
       </w:r>
     </w:p>
     <w:p>
@@ -2254,7 +2254,7 @@
         <w:t xml:space="preserve">H2: </w:t>
       </w:r>
       <w:r>
-        <w:t xml:space="preserve">Built to pass your security review — not just your pilot.</w:t>
+        <w:t xml:space="preserve">Built to pass your security review.</w:t>
       </w:r>
     </w:p>
     <w:p>
@@ -2269,7 +2269,7 @@
         <w:t xml:space="preserve">Cards: </w:t>
       </w:r>
       <w:r>
-        <w:t xml:space="preserve">Deploy within your boundary (on-prem / private cloud / managed, AU data residency) · Provable by design (audit trails) · Integrates with systems of record.</w:t>
+        <w:t xml:space="preserve">Deploy within your boundary (on-prem / private cloud / managed, AU data residency) · A record of every call (audit trails) · Integrates with systems of record.</w:t>
       </w:r>
     </w:p>
     <w:p>
@@ -2301,10 +2301,10 @@
           <w:bCs/>
           <w:color w:val="0C8577"/>
         </w:rPr>
-        <w:t xml:space="preserve">CONFIRM — HIGHEST RISK  </w:t>
-      </w:r>
-      <w:r>
-        <w:t xml:space="preserve">State which certifications are currently HELD vs IN PROGRESS and adjust wording (e.g. a chip “SOC 2 Type II — in progress”, or an “Aligned to” grouping). Over-claiming certs is the item an enterprise security reviewer will catch first.</w:t>
+        <w:t xml:space="preserve">CONFIRM, HIGHEST RISK  </w:t>
+      </w:r>
+      <w:r>
+        <w:t xml:space="preserve">State which certifications are currently HELD vs IN PROGRESS and adjust wording (e.g. a chip “SOC 2 Type II, in progress”, or an “Aligned to” grouping). Over-claiming certs is the item an enterprise security reviewer will catch first.</w:t>
       </w:r>
     </w:p>
     <w:p>
@@ -2498,7 +2498,7 @@
         <w:spacing w:after="120" w:line="276"/>
       </w:pPr>
       <w:r>
-        <w:t xml:space="preserve">Three combined cards — each founder shown ONCE with monogram, name, role, a vantage label, a one-line perspective, then full bio + tags:</w:t>
+        <w:t xml:space="preserve">Three combined cards, each founder shown ONCE with monogram, name, role, a vantage label, a one-line perspective, then full bio + tags:</w:t>
       </w:r>
     </w:p>
     <w:p>
@@ -2515,7 +2515,7 @@
           <w:b/>
           <w:bCs/>
         </w:rPr>
-        <w:t xml:space="preserve">Rob Petreski — CEO </w:t>
+        <w:t xml:space="preserve">Rob Petreski, CEO </w:t>
       </w:r>
       <w:r>
         <w:t xml:space="preserve">(The operator)</w:t>
@@ -2535,7 +2535,7 @@
           <w:b/>
           <w:bCs/>
         </w:rPr>
-        <w:t xml:space="preserve">Laurence Latin — Co-Founder &amp; CTO </w:t>
+        <w:t xml:space="preserve">Laurence Latin, Co-Founder &amp; CTO </w:t>
       </w:r>
       <w:r>
         <w:t xml:space="preserve">(The engineer)</w:t>
@@ -2555,7 +2555,7 @@
           <w:b/>
           <w:bCs/>
         </w:rPr>
-        <w:t xml:space="preserve">Ming Xu — Co-Founder &amp; COO </w:t>
+        <w:t xml:space="preserve">Ming Xu, Co-Founder &amp; COO </w:t>
       </w:r>
       <w:r>
         <w:t xml:space="preserve">(The builder)</w:t>
@@ -2593,7 +2593,7 @@
         <w:t xml:space="preserve">ASSET + CONFIRM  </w:t>
       </w:r>
       <w:r>
-        <w:t xml:space="preserve">Replace RP/LL/MX monograms with real headshots (§8). Confirm pronouns for each founder — bios are written to read cleanly without third-person pronouns, but confirm so future edits stay correct.</w:t>
+        <w:t xml:space="preserve">Replace RP/LL/MX monograms with real headshots (§8). Confirm pronouns for each founder, bios are written to read cleanly without third-person pronouns, but confirm so future edits stay correct.</w:t>
       </w:r>
     </w:p>
     <w:p>
@@ -2645,7 +2645,7 @@
         <w:t xml:space="preserve">Values: </w:t>
       </w:r>
       <w:r>
-        <w:t xml:space="preserve">Resolution not conversation · Compliance is foundational · Action in real systems · Earn trust on the hardest calls.</w:t>
+        <w:t xml:space="preserve">Resolution over conversation · Compliance is foundational · Action in real systems · Earn trust on the hardest calls.</w:t>
       </w:r>
     </w:p>
     <w:p>
@@ -2745,7 +2745,7 @@
         <w:t xml:space="preserve">CTA + footer: </w:t>
       </w:r>
       <w:r>
-        <w:t xml:space="preserve">“Bring us your hardest conversations.” DEV: add legal links (Privacy, Terms, Security/Trust).</w:t>
+        <w:t xml:space="preserve">“Let's talk about your hardest conversations.” DEV: add legal links (Privacy, Terms, Security/Trust).</w:t>
       </w:r>
     </w:p>
     <w:p>
@@ -2934,7 +2934,7 @@
           <w:sz w:val="16"/>
           <w:szCs w:val="16"/>
         </w:rPr>
-        <w:t xml:space="preserve">     high-stakes, regulated conversations end-to-end.",</w:t>
+        <w:t xml:space="preserve">     high-stakes, regulated conversations from start to finish.",</w:t>
       </w:r>
     </w:p>
     <w:p>
@@ -3279,7 +3279,7 @@
         <w:t xml:space="preserve">FAQPage: </w:t>
       </w:r>
       <w:r>
-        <w:t xml:space="preserve">the full block is in about-trillet.html (search “\"@type\": \"FAQPage\"”). It mirrors the seven visible FAQ answers verbatim — copy it as-is.</w:t>
+        <w:t xml:space="preserve">the full block is in about-trillet.html (search “\"@type\": \"FAQPage\"”). It mirrors the seven visible FAQ answers verbatim, copy it as-is.</w:t>
       </w:r>
     </w:p>
     <w:p>
@@ -3312,7 +3312,7 @@
         <w:spacing w:after="70" w:line="264"/>
       </w:pPr>
       <w:r>
-        <w:t xml:space="preserve">Canonical host — pick one host (apex vs www) site-wide; this page assumes www.trillet.ai.</w:t>
+        <w:t xml:space="preserve">Canonical host, pick one host (apex vs www) site-wide; this page assumes www.trillet.ai.</w:t>
       </w:r>
     </w:p>
     <w:p>
@@ -3325,7 +3325,7 @@
         <w:spacing w:after="70" w:line="264"/>
       </w:pPr>
       <w:r>
-        <w:t xml:space="preserve">FAQ schema — implemented; targets “People Also Ask” and AI Overviews.</w:t>
+        <w:t xml:space="preserve">FAQ schema, implemented; targets “People Also Ask” and AI Overviews.</w:t>
       </w:r>
     </w:p>
     <w:p>
@@ -3351,7 +3351,7 @@
         <w:spacing w:after="70" w:line="264"/>
       </w:pPr>
       <w:r>
-        <w:t xml:space="preserve">Internal links (footer + industry cards) distribute link equity — make industry “Explore →” links real /industries/* URLs.</w:t>
+        <w:t xml:space="preserve">Internal links (footer + industry cards) distribute link equity, make industry “Explore →” links real /industries/* URLs.</w:t>
       </w:r>
     </w:p>
     <w:p>
@@ -3364,7 +3364,7 @@
         <w:spacing w:after="70" w:line="264"/>
       </w:pPr>
       <w:r>
-        <w:t xml:space="preserve">One H1, clean heading tree — as built.</w:t>
+        <w:t xml:space="preserve">One H1, clean heading tree, as built.</w:t>
       </w:r>
     </w:p>
     <w:p>
@@ -3377,7 +3377,7 @@
         <w:spacing w:after="70" w:line="264"/>
       </w:pPr>
       <w:r>
-        <w:t xml:space="preserve">llms.txt (recommended) — add www.trillet.ai/llms.txt summarising what Trillet is, industries, differentiators, and this About URL.</w:t>
+        <w:t xml:space="preserve">llms.txt (recommended), add www.trillet.ai/llms.txt summarising what Trillet is, industries, differentiators, and this About URL.</w:t>
       </w:r>
     </w:p>
     <w:p>
@@ -3390,7 +3390,7 @@
         <w:spacing w:after="70" w:line="264"/>
       </w:pPr>
       <w:r>
-        <w:t xml:space="preserve">OG image — supply a branded 1200×630 so shared links render well.</w:t>
+        <w:t xml:space="preserve">OG image, supply a branded 1200×630 so shared links render well.</w:t>
       </w:r>
     </w:p>
     <w:p>
@@ -3428,7 +3428,7 @@
         <w:spacing w:after="70" w:line="264"/>
       </w:pPr>
       <w:r>
-        <w:t xml:space="preserve">Visible keyboard focus via :focus-visible — keep it.</w:t>
+        <w:t xml:space="preserve">Visible keyboard focus via :focus-visible, keep it.</w:t>
       </w:r>
     </w:p>
     <w:p>
@@ -3860,7 +3860,7 @@
         <w:spacing w:after="120" w:line="276"/>
       </w:pPr>
       <w:r>
-        <w:t xml:space="preserve">The page ships the moment these are cleared. None are code problems — they are facts and assets only Trillet can confirm.</w:t>
+        <w:t xml:space="preserve">The page ships the moment these are cleared. None are code problems, they are facts and assets only Trillet can confirm.</w:t>
       </w:r>
     </w:p>
     <w:p>
@@ -3873,7 +3873,7 @@
         <w:spacing w:after="80"/>
       </w:pPr>
       <w:r>
-        <w:t xml:space="preserve">☐  Metrics — 1,200+ businesses · 7M+ calls (2025) · 85% resolution · 80% cost reduction · 99.97% uptime · 4.6 Trustpilot (20 reviews). Confirm each is current and public.</w:t>
+        <w:t xml:space="preserve">☐  Metrics, 1,200+ businesses · 7M+ calls (2025) · 85% resolution · 80% cost reduction · 99.97% uptime · 4.6 Trustpilot (20 reviews). Confirm each is current and public.</w:t>
       </w:r>
     </w:p>
     <w:p>
@@ -3886,7 +3886,7 @@
         <w:spacing w:after="80"/>
       </w:pPr>
       <w:r>
-        <w:t xml:space="preserve">☐  Certifications — state which of SOC 2 Type II / ISO 27001 / HIPAA / GDPR / TCPA / ACMA are held vs in progress, and adjust wording (§4.7).</w:t>
+        <w:t xml:space="preserve">☐  Certifications, state which of SOC 2 Type II / ISO 27001 / HIPAA / GDPR / TCPA / ACMA are held vs in progress, and adjust wording (§4.7).</w:t>
       </w:r>
     </w:p>
     <w:p>

</xml_diff>